<commit_message>
docs: expand user guides with voice notes, categories, client matching, translation and printing
</commit_message>
<xml_diff>
--- a/docs/guide/user_guide_af.docx
+++ b/docs/guide/user_guide_af.docx
@@ -12,25 +12,11 @@
           <w:rFonts w:ascii="Arial" w:hAnsi="Arial"/>
           <w:b/>
           <w:color w:val="1E3A8A"/>
-          <w:sz w:val="48"/>
+          <w:sz w:val="44"/>
         </w:rPr>
         <w:t>MY MEMORY LODGE ASSISTENT</w:t>
         <w:br/>
-        <w:t>GEBRUIKERSGIDS</w:t>
-      </w:r>
-    </w:p>
-    <w:p>
-      <w:pPr>
-        <w:spacing w:before="280" w:after="120"/>
-      </w:pPr>
-      <w:r>
-        <w:rPr>
-          <w:rFonts w:ascii="Arial" w:hAnsi="Arial"/>
-          <w:b/>
-          <w:color w:val="1E3A8A"/>
-          <w:sz w:val="32"/>
-        </w:rPr>
-        <w:t>1. Inleiding</w:t>
+        <w:t>VOLLEDIGE GEBRUIKERSGIDS</w:t>
       </w:r>
     </w:p>
     <w:p>
@@ -42,7 +28,7 @@
           <w:rFonts w:ascii="Arial" w:hAnsi="Arial"/>
           <w:b w:val="0"/>
           <w:i w:val="0"/>
-          <w:sz w:val="22"/>
+          <w:sz w:val="21"/>
         </w:rPr>
         <w:t xml:space="preserve">Welkom by die </w:t>
       </w:r>
@@ -51,7 +37,7 @@
           <w:rFonts w:ascii="Arial" w:hAnsi="Arial"/>
           <w:b/>
           <w:i w:val="0"/>
-          <w:sz w:val="22"/>
+          <w:sz w:val="21"/>
         </w:rPr>
         <w:t>My Memory Lodge Assistent</w:t>
       </w:r>
@@ -60,7 +46,7 @@
           <w:rFonts w:ascii="Arial" w:hAnsi="Arial"/>
           <w:b w:val="0"/>
           <w:i w:val="0"/>
-          <w:sz w:val="22"/>
+          <w:sz w:val="21"/>
         </w:rPr>
         <w:t>, 'n verenigde toepassing wat ontwerp is om gaste-registrasies, stemmemo's, kalenderbesprekings en inkopietake vir lodge-bestuurders te vergemaklik. Die stelsel beskik oor 'n Android selfoontoepassing vir personeel op die pad, en 'n webbestuurspaneel.</w:t>
       </w:r>
@@ -74,9 +60,9 @@
           <w:rFonts w:ascii="Arial" w:hAnsi="Arial"/>
           <w:b/>
           <w:color w:val="1E3A8A"/>
-          <w:sz w:val="32"/>
+          <w:sz w:val="28"/>
         </w:rPr>
-        <w:t>2. Selfoontoepassing Gids</w:t>
+        <w:t>1. Sekuriteit en Privaatheid (Toegangsmagtiging)</w:t>
       </w:r>
     </w:p>
     <w:p>
@@ -88,27 +74,9 @@
           <w:rFonts w:ascii="Arial" w:hAnsi="Arial"/>
           <w:b w:val="0"/>
           <w:i w:val="0"/>
-          <w:sz w:val="22"/>
+          <w:sz w:val="21"/>
         </w:rPr>
-        <w:t>Die selfoontoepassing (</w:t>
-      </w:r>
-      <w:r>
-        <w:rPr>
-          <w:rFonts w:ascii="Arial" w:hAnsi="Arial"/>
-          <w:b/>
-          <w:i w:val="0"/>
-          <w:sz w:val="22"/>
-        </w:rPr>
-        <w:t>MyMemory-v6-Passport.apk</w:t>
-      </w:r>
-      <w:r>
-        <w:rPr>
-          <w:rFonts w:ascii="Arial" w:hAnsi="Arial"/>
-          <w:b w:val="0"/>
-          <w:i w:val="0"/>
-          <w:sz w:val="22"/>
-        </w:rPr>
-        <w:t>) stel bestuurders in staat om stemopnames, kalenderinskrywings en paspoortskandering vanaf hul fone te doen. Volg hierdie stappe om 'n gas te skandeer:</w:t>
+        <w:t>Om die privaatheid van gaste te respekteer en sensitiewe persoonlike besonderhede (soos paspoortfoto's, identiteitsnommers en kontakbesonderhede) te beskerm, vereis die stelsel veilige gebruiker-magtiging:</w:t>
       </w:r>
     </w:p>
     <w:p>
@@ -121,16 +89,16 @@
         <w:rPr>
           <w:rFonts w:ascii="Arial" w:hAnsi="Arial"/>
           <w:b/>
-          <w:sz w:val="22"/>
+          <w:sz w:val="21"/>
         </w:rPr>
-        <w:t>Maak Gaste-oortjie Oop:</w:t>
+        <w:t>Veilige Aantekening:</w:t>
       </w:r>
       <w:r>
         <w:rPr>
           <w:rFonts w:ascii="Arial" w:hAnsi="Arial"/>
-          <w:sz w:val="22"/>
+          <w:sz w:val="21"/>
         </w:rPr>
-        <w:t xml:space="preserve"> Navigeer na die 'Guests'-oortjie in die onderste kieslys.</w:t>
+        <w:t xml:space="preserve"> Beide die webpaneel en selfoontoepassing vereis aanmelding. Toegangstokens (JWT) verval outomaties om ongemagtigde toegang te voorkom.</w:t>
       </w:r>
     </w:p>
     <w:p>
@@ -143,16 +111,16 @@
         <w:rPr>
           <w:rFonts w:ascii="Arial" w:hAnsi="Arial"/>
           <w:b/>
-          <w:sz w:val="22"/>
+          <w:sz w:val="21"/>
         </w:rPr>
-        <w:t>Skandeer Paspoort:</w:t>
+        <w:t>Privaatheidswaarborge:</w:t>
       </w:r>
       <w:r>
         <w:rPr>
           <w:rFonts w:ascii="Arial" w:hAnsi="Arial"/>
-          <w:sz w:val="22"/>
+          <w:sz w:val="21"/>
         </w:rPr>
-        <w:t xml:space="preserve"> Tik op die groen drywende skandeerder-ikoon. Die kamera sal oopmaak. Plaas die paspoort horisontaal, rig dit duidelik in die raam, en neem die foto.</w:t>
+        <w:t xml:space="preserve"> Alle paspoortrekords en stemmemo's word geënkripteer tydens versending en veilig in 'n PostgreSQL-databasis bewaar.</w:t>
       </w:r>
     </w:p>
     <w:p>
@@ -165,16 +133,44 @@
         <w:rPr>
           <w:rFonts w:ascii="Arial" w:hAnsi="Arial"/>
           <w:b/>
-          <w:sz w:val="22"/>
+          <w:sz w:val="21"/>
         </w:rPr>
-        <w:t>NVIDIA NIM OCR Ekstraksie:</w:t>
+        <w:t>E-pos Opsporing:</w:t>
       </w:r>
       <w:r>
         <w:rPr>
           <w:rFonts w:ascii="Arial" w:hAnsi="Arial"/>
-          <w:sz w:val="22"/>
+          <w:sz w:val="21"/>
         </w:rPr>
-        <w:t xml:space="preserve"> Die toepassing laai die foto op na die NVIDIA Llama-3.2 Vision NIM OCR-stelsel op die bediener. Binne sekondes vul dit die vorm in (Volle Naam, Nasionaliteit, Geboortedatum, Vervaldata, Paspoortnommer).</w:t>
+        <w:t xml:space="preserve"> Gasteprofiele bevat 'n 'Created by'-ouditkolom wat elke geskandeerde inskrywing koppel aan die e-posadres van die personeellid wat dit gestoor het.</w:t>
+      </w:r>
+    </w:p>
+    <w:p>
+      <w:pPr>
+        <w:spacing w:before="280" w:after="120"/>
+      </w:pPr>
+      <w:r>
+        <w:rPr>
+          <w:rFonts w:ascii="Arial" w:hAnsi="Arial"/>
+          <w:b/>
+          <w:color w:val="1E3A8A"/>
+          <w:sz w:val="28"/>
+        </w:rPr>
+        <w:t>2. Stemmemo's en Outomatiese Transkripsie</w:t>
+      </w:r>
+    </w:p>
+    <w:p>
+      <w:pPr>
+        <w:spacing w:after="80"/>
+      </w:pPr>
+      <w:r>
+        <w:rPr>
+          <w:rFonts w:ascii="Arial" w:hAnsi="Arial"/>
+          <w:b w:val="0"/>
+          <w:i w:val="0"/>
+          <w:sz w:val="21"/>
+        </w:rPr>
+        <w:t>Personeel kan direk met hul fone praat om memo's te skep en inkopie-items by te voeg:</w:t>
       </w:r>
     </w:p>
     <w:p>
@@ -187,16 +183,16 @@
         <w:rPr>
           <w:rFonts w:ascii="Arial" w:hAnsi="Arial"/>
           <w:b/>
-          <w:sz w:val="22"/>
+          <w:sz w:val="21"/>
         </w:rPr>
-        <w:t>Verifieer en Kies Datums:</w:t>
+        <w:t>Stemmaak van Memo's:</w:t>
       </w:r>
       <w:r>
         <w:rPr>
           <w:rFonts w:ascii="Arial" w:hAnsi="Arial"/>
-          <w:sz w:val="22"/>
+          <w:sz w:val="21"/>
         </w:rPr>
-        <w:t xml:space="preserve"> Tik op die datums om inklok- (check-in) en uitklok- (check-out) datums te kies. Indien leeg gelaat, kies dit outomaties vandag en môre as standaarddatums. Gaan die velde na en wysig enige spelfoute handmatig.</w:t>
+        <w:t xml:space="preserve"> Hou die mikrofoon-ikoon in die selfoontoepassing in om klank op te neem. Die stelsel transkribeer die steminvoer outomaties na Engelse teks.</w:t>
       </w:r>
     </w:p>
     <w:p>
@@ -209,16 +205,16 @@
         <w:rPr>
           <w:rFonts w:ascii="Arial" w:hAnsi="Arial"/>
           <w:b/>
-          <w:sz w:val="22"/>
+          <w:sz w:val="21"/>
         </w:rPr>
-        <w:t>Stoor Gasteprofiel:</w:t>
+        <w:t>Afrikaans/Engelse Vertaling:</w:t>
       </w:r>
       <w:r>
         <w:rPr>
           <w:rFonts w:ascii="Arial" w:hAnsi="Arial"/>
-          <w:sz w:val="22"/>
+          <w:sz w:val="21"/>
         </w:rPr>
-        <w:t xml:space="preserve"> Klik op 'Save'. Die profiel, datums, e-posadres van die skandeerder-rekening (skepper e-pos) en die paspoortfoto word veilig in die databasis gestoor.</w:t>
+        <w:t xml:space="preserve"> Die transkripsiestelsel verwerk stemopnames in beide Engels en Afrikaans, en skakel Afrikaanse stemopnames direk om na Engelse opsommings.</w:t>
       </w:r>
     </w:p>
     <w:p>
@@ -231,16 +227,16 @@
         <w:rPr>
           <w:rFonts w:ascii="Arial" w:hAnsi="Arial"/>
           <w:b/>
-          <w:sz w:val="22"/>
+          <w:sz w:val="21"/>
         </w:rPr>
-        <w:t>Soek volgens Datum:</w:t>
+        <w:t>Outomatiese Ontleding:</w:t>
       </w:r>
       <w:r>
         <w:rPr>
           <w:rFonts w:ascii="Arial" w:hAnsi="Arial"/>
-          <w:sz w:val="22"/>
+          <w:sz w:val="21"/>
         </w:rPr>
-        <w:t xml:space="preserve"> Tik op die kalender-ikoon in die bopaneel om 'n datum te kies en slegs die gaste met aktiewe besprekings op daardie dag te sien.</w:t>
+        <w:t xml:space="preserve"> Die stelsel gebruik KI om jou teks te ontleed. As jy sê 'add milk, sugar and eggs to the shopping list', skep dit aparte items in die inkopiemandjie.</w:t>
       </w:r>
     </w:p>
     <w:p>
@@ -252,9 +248,9 @@
           <w:rFonts w:ascii="Arial" w:hAnsi="Arial"/>
           <w:b/>
           <w:color w:val="1E3A8A"/>
-          <w:sz w:val="32"/>
+          <w:sz w:val="28"/>
         </w:rPr>
-        <w:t>3. Webbestuurpaneel Gids</w:t>
+        <w:t>3. Organisasie volgens Kliënt se Naam</w:t>
       </w:r>
     </w:p>
     <w:p>
@@ -266,9 +262,9 @@
           <w:rFonts w:ascii="Arial" w:hAnsi="Arial"/>
           <w:b w:val="0"/>
           <w:i w:val="0"/>
-          <w:sz w:val="22"/>
+          <w:sz w:val="21"/>
         </w:rPr>
-        <w:t>Die React-paneel bied 'n volledige desktop beheersentrum vir die lodge-administrasie:</w:t>
+        <w:t>Memo's, besprekings en instruksies word gegroepeer en georganiseer volgens die kliënt of gas se naam vir maklike opsporing:</w:t>
       </w:r>
     </w:p>
     <w:p>
@@ -281,16 +277,16 @@
         <w:rPr>
           <w:rFonts w:ascii="Arial" w:hAnsi="Arial"/>
           <w:b/>
-          <w:sz w:val="22"/>
+          <w:sz w:val="21"/>
         </w:rPr>
-        <w:t>Gaste-gids:</w:t>
+        <w:t>Koppel aan Kliënt:</w:t>
       </w:r>
       <w:r>
         <w:rPr>
           <w:rFonts w:ascii="Arial" w:hAnsi="Arial"/>
-          <w:sz w:val="22"/>
+          <w:sz w:val="21"/>
         </w:rPr>
-        <w:t xml:space="preserve"> Gaan na die 'Guests &amp; Reservations'-oortjie om alle besprekings en gaste-lyste te besigtig.</w:t>
+        <w:t xml:space="preserve"> Koppel stemmemo's aan kliënte se name tydens die opname om take direk aan spesifieke gaste toe te wys.</w:t>
       </w:r>
     </w:p>
     <w:p>
@@ -303,16 +299,44 @@
         <w:rPr>
           <w:rFonts w:ascii="Arial" w:hAnsi="Arial"/>
           <w:b/>
-          <w:sz w:val="22"/>
+          <w:sz w:val="21"/>
         </w:rPr>
-        <w:t>Oplaai en Rotasie van Foto:</w:t>
+        <w:t>Gesentraliseerde Gasterekords:</w:t>
       </w:r>
       <w:r>
         <w:rPr>
           <w:rFonts w:ascii="Arial" w:hAnsi="Arial"/>
-          <w:sz w:val="22"/>
+          <w:sz w:val="21"/>
         </w:rPr>
-        <w:t xml:space="preserve"> Onder die Gaste-gids oortjie, sleep-en-los of kies 'n paspoortfoto. As die foto op sy sy lê, klik op 'Rotate 90°' om dit regop te draai voordat jy dit indien.</w:t>
+        <w:t xml:space="preserve"> Sien aktiewe besprekings, verblyfperiodes en notas wat spesifiek aan individuele gaste gekoppel is in die webpaneel.</w:t>
+      </w:r>
+    </w:p>
+    <w:p>
+      <w:pPr>
+        <w:spacing w:before="280" w:after="120"/>
+      </w:pPr>
+      <w:r>
+        <w:rPr>
+          <w:rFonts w:ascii="Arial" w:hAnsi="Arial"/>
+          <w:b/>
+          <w:color w:val="1E3A8A"/>
+          <w:sz w:val="28"/>
+        </w:rPr>
+        <w:t>4. Inkopielyste (Gesorteer en Gekategoriseer)</w:t>
+      </w:r>
+    </w:p>
+    <w:p>
+      <w:pPr>
+        <w:spacing w:after="80"/>
+      </w:pPr>
+      <w:r>
+        <w:rPr>
+          <w:rFonts w:ascii="Arial" w:hAnsi="Arial"/>
+          <w:b w:val="0"/>
+          <w:i w:val="0"/>
+          <w:sz w:val="21"/>
+        </w:rPr>
+        <w:t>Bestuur voorraad en voorrade doeltreffend met outomatiese inkopie-sortering:</w:t>
       </w:r>
     </w:p>
     <w:p>
@@ -325,16 +349,16 @@
         <w:rPr>
           <w:rFonts w:ascii="Arial" w:hAnsi="Arial"/>
           <w:b/>
-          <w:sz w:val="22"/>
+          <w:sz w:val="21"/>
         </w:rPr>
-        <w:t>Begin OCR Skandering:</w:t>
+        <w:t>Outomatiese Sortering:</w:t>
       </w:r>
       <w:r>
         <w:rPr>
           <w:rFonts w:ascii="Arial" w:hAnsi="Arial"/>
-          <w:sz w:val="22"/>
+          <w:sz w:val="21"/>
         </w:rPr>
-        <w:t xml:space="preserve"> Klik op 'Run OCR Scan'. Die stelsel draai die foto regop op 'n canvas, skandeer die teks en maak die vooraf-ingevulde wysigbare vorm oop.</w:t>
+        <w:t xml:space="preserve"> Inkopie-items word outomaties deur KI in afdelings (bv. Voedsel, Skoonmaakmiddels, Lodge-benodigdhede) gesorteer op grond van die itemnaam.</w:t>
       </w:r>
     </w:p>
     <w:p>
@@ -347,16 +371,44 @@
         <w:rPr>
           <w:rFonts w:ascii="Arial" w:hAnsi="Arial"/>
           <w:b/>
-          <w:sz w:val="22"/>
+          <w:sz w:val="21"/>
         </w:rPr>
-        <w:t>Wysig en Koppel Bespreking:</w:t>
+        <w:t>Kategorie-filtering:</w:t>
       </w:r>
       <w:r>
         <w:rPr>
           <w:rFonts w:ascii="Arial" w:hAnsi="Arial"/>
-          <w:sz w:val="22"/>
+          <w:sz w:val="21"/>
         </w:rPr>
-        <w:t xml:space="preserve"> Inklok- en uitklokdatums op die vorm kies outomaties vandag en môre, maar is ten volle wysigbaar. Wysig die velde en klik Save om die profiel en foto te stoor.</w:t>
+        <w:t xml:space="preserve"> Die webpaneel stel bestuurders in staat om georganiseerde items te hersien, verwerkte items te verwyder en volgens kategorie te sorteer.</w:t>
+      </w:r>
+    </w:p>
+    <w:p>
+      <w:pPr>
+        <w:spacing w:before="280" w:after="120"/>
+      </w:pPr>
+      <w:r>
+        <w:rPr>
+          <w:rFonts w:ascii="Arial" w:hAnsi="Arial"/>
+          <w:b/>
+          <w:color w:val="1E3A8A"/>
+          <w:sz w:val="28"/>
+        </w:rPr>
+        <w:t>5. Gaste-Paspoortskandering en Rotasie</w:t>
+      </w:r>
+    </w:p>
+    <w:p>
+      <w:pPr>
+        <w:spacing w:after="80"/>
+      </w:pPr>
+      <w:r>
+        <w:rPr>
+          <w:rFonts w:ascii="Arial" w:hAnsi="Arial"/>
+          <w:b w:val="0"/>
+          <w:i w:val="0"/>
+          <w:sz w:val="21"/>
+        </w:rPr>
+        <w:t>Lodge-bestuurders kan paspoorte op die perseel of vanaf die rekenaar skandeer:</w:t>
       </w:r>
     </w:p>
     <w:p>
@@ -369,16 +421,16 @@
         <w:rPr>
           <w:rFonts w:ascii="Arial" w:hAnsi="Arial"/>
           <w:b/>
-          <w:sz w:val="22"/>
+          <w:sz w:val="21"/>
         </w:rPr>
-        <w:t>Besigtig Paspoortfoto:</w:t>
+        <w:t>Selfoonskandering:</w:t>
       </w:r>
       <w:r>
         <w:rPr>
           <w:rFonts w:ascii="Arial" w:hAnsi="Arial"/>
-          <w:sz w:val="22"/>
+          <w:sz w:val="21"/>
         </w:rPr>
-        <w:t xml:space="preserve"> Klik op die 'View Passport File'-skakel (kamera-ikoon) langs enige gasteprofiel om die oorspronklike paspoortfoto in 'n nuwe oortjie te besigtig.</w:t>
+        <w:t xml:space="preserve"> Gebruik die foon se kamera om paspoorte te skandeer. Die NVIDIA Llama-3.2 Vision NIM API onttrek profielvelde binne sekondes.</w:t>
       </w:r>
     </w:p>
     <w:p>
@@ -391,16 +443,132 @@
         <w:rPr>
           <w:rFonts w:ascii="Arial" w:hAnsi="Arial"/>
           <w:b/>
-          <w:sz w:val="22"/>
+          <w:sz w:val="21"/>
         </w:rPr>
-        <w:t>Datum-filtering:</w:t>
+        <w:t>Web-oplaai en Rotasie:</w:t>
       </w:r>
       <w:r>
         <w:rPr>
           <w:rFonts w:ascii="Arial" w:hAnsi="Arial"/>
-          <w:sz w:val="22"/>
+          <w:sz w:val="21"/>
         </w:rPr>
-        <w:t xml:space="preserve"> Tik 'n datum in die kalender-soekkassie in om onmiddellik die gaste te sien wat op daardie dag 'n aktiewe bespreking het.</w:t>
+        <w:t xml:space="preserve"> Laai foto's direk op in die Gaste-gids. Gebruik die 'Rotate 90°'-knoppie om gedraaide foto's regop te draai voor skandering. Die reggemaakte foto word in die databasis gestoor.</w:t>
+      </w:r>
+    </w:p>
+    <w:p>
+      <w:pPr>
+        <w:pStyle w:val="ListBullet"/>
+        <w:spacing w:after="40"/>
+        <w:ind w:left="360"/>
+      </w:pPr>
+      <w:r>
+        <w:rPr>
+          <w:rFonts w:ascii="Arial" w:hAnsi="Arial"/>
+          <w:b/>
+          <w:sz w:val="21"/>
+        </w:rPr>
+        <w:t>Besprekingsdatums en Wysiging:</w:t>
+      </w:r>
+      <w:r>
+        <w:rPr>
+          <w:rFonts w:ascii="Arial" w:hAnsi="Arial"/>
+          <w:sz w:val="21"/>
+        </w:rPr>
+        <w:t xml:space="preserve"> Voer inklok- en uitklokdatums in met die datumkiesers (verstek na vandag en môre). Die vorm bly ten volle wysigbaar vir handmatige regstellings.</w:t>
+      </w:r>
+    </w:p>
+    <w:p>
+      <w:pPr>
+        <w:pStyle w:val="ListBullet"/>
+        <w:spacing w:after="40"/>
+        <w:ind w:left="360"/>
+      </w:pPr>
+      <w:r>
+        <w:rPr>
+          <w:rFonts w:ascii="Arial" w:hAnsi="Arial"/>
+          <w:b/>
+          <w:sz w:val="21"/>
+        </w:rPr>
+        <w:t>Soek op Datum:</w:t>
+      </w:r>
+      <w:r>
+        <w:rPr>
+          <w:rFonts w:ascii="Arial" w:hAnsi="Arial"/>
+          <w:sz w:val="21"/>
+        </w:rPr>
+        <w:t xml:space="preserve"> Soek paspoorte onmiddellik deur 'n datum in die soekbalk in te voer om alle gaste met aktiewe besprekings op daardie dag te sien.</w:t>
+      </w:r>
+    </w:p>
+    <w:p>
+      <w:pPr>
+        <w:spacing w:before="280" w:after="120"/>
+      </w:pPr>
+      <w:r>
+        <w:rPr>
+          <w:rFonts w:ascii="Arial" w:hAnsi="Arial"/>
+          <w:b/>
+          <w:color w:val="1E3A8A"/>
+          <w:sz w:val="28"/>
+        </w:rPr>
+        <w:t>6. Drukwerk en Taal-wisseling</w:t>
+      </w:r>
+    </w:p>
+    <w:p>
+      <w:pPr>
+        <w:spacing w:after="80"/>
+      </w:pPr>
+      <w:r>
+        <w:rPr>
+          <w:rFonts w:ascii="Arial" w:hAnsi="Arial"/>
+          <w:b w:val="0"/>
+          <w:i w:val="0"/>
+          <w:sz w:val="21"/>
+        </w:rPr>
+        <w:t>Die webpaneel ondersteun buigsame aanbiedingsopsies:</w:t>
+      </w:r>
+    </w:p>
+    <w:p>
+      <w:pPr>
+        <w:pStyle w:val="ListBullet"/>
+        <w:spacing w:after="40"/>
+        <w:ind w:left="360"/>
+      </w:pPr>
+      <w:r>
+        <w:rPr>
+          <w:rFonts w:ascii="Arial" w:hAnsi="Arial"/>
+          <w:b/>
+          <w:sz w:val="21"/>
+        </w:rPr>
+        <w:t>Taal-wisseling:</w:t>
+      </w:r>
+      <w:r>
+        <w:rPr>
+          <w:rFonts w:ascii="Arial" w:hAnsi="Arial"/>
+          <w:sz w:val="21"/>
+        </w:rPr>
+        <w:t xml:space="preserve"> Klik op die taalvlag in die bopaneel om die hele skerm onmiddellik tussen Engels en Portugees te wissel.</w:t>
+      </w:r>
+    </w:p>
+    <w:p>
+      <w:pPr>
+        <w:pStyle w:val="ListBullet"/>
+        <w:spacing w:after="40"/>
+        <w:ind w:left="360"/>
+      </w:pPr>
+      <w:r>
+        <w:rPr>
+          <w:rFonts w:ascii="Arial" w:hAnsi="Arial"/>
+          <w:b/>
+          <w:sz w:val="21"/>
+        </w:rPr>
+        <w:t>Druk van Lyste:</w:t>
+      </w:r>
+      <w:r>
+        <w:rPr>
+          <w:rFonts w:ascii="Arial" w:hAnsi="Arial"/>
+          <w:sz w:val="21"/>
+        </w:rPr>
+        <w:t xml:space="preserve"> Alle opsommings, gasteprofiele en inkopielyste is drukker-vriendelik geformatteer. Gebruik die blaaier se drukbevel (Ctrl+P) om fisiese lyste uit te druk.</w:t>
       </w:r>
     </w:p>
     <w:sectPr>

</xml_diff>